<commit_message>
feat: updateProduct & deleteProduct
</commit_message>
<xml_diff>
--- a/Slot4/evidence.docx
+++ b/Slot4/evidence.docx
@@ -28,7 +28,7 @@
                     <pic:cNvPicPr/>
                   </pic:nvPicPr>
                   <pic:blipFill>
-                    <a:blip r:embed="rId5"/>
+                    <a:blip r:embed="rId7"/>
                     <a:stretch>
                       <a:fillRect/>
                     </a:stretch>
@@ -84,7 +84,7 @@
                     <pic:cNvPicPr/>
                   </pic:nvPicPr>
                   <pic:blipFill>
-                    <a:blip r:embed="rId6"/>
+                    <a:blip r:embed="rId8"/>
                     <a:stretch>
                       <a:fillRect/>
                     </a:stretch>
@@ -115,6 +115,9 @@
     </w:p>
     <w:p>
       <w:r>
+        <w:rPr>
+          <w:noProof/>
+        </w:rPr>
         <w:drawing>
           <wp:inline distT="0" distB="0" distL="0" distR="0" wp14:anchorId="4EE7FFFB" wp14:editId="403B14B0">
             <wp:extent cx="5943600" cy="2762250"/>
@@ -131,7 +134,7 @@
                     <pic:cNvPicPr/>
                   </pic:nvPicPr>
                   <pic:blipFill>
-                    <a:blip r:embed="rId7"/>
+                    <a:blip r:embed="rId9"/>
                     <a:stretch>
                       <a:fillRect/>
                     </a:stretch>
@@ -152,6 +155,310 @@
         </w:drawing>
       </w:r>
     </w:p>
+    <w:p>
+      <w:pPr>
+        <w:rPr>
+          <w:noProof/>
+        </w:rPr>
+      </w:pPr>
+      <w:r>
+        <w:rPr>
+          <w:noProof/>
+        </w:rPr>
+        <w:lastRenderedPageBreak/>
+        <w:drawing>
+          <wp:inline distT="0" distB="0" distL="114300" distR="114300" wp14:anchorId="4DCCB169" wp14:editId="40BED951">
+            <wp:extent cx="5264785" cy="2192020"/>
+            <wp:effectExtent l="0" t="0" r="8255" b="2540"/>
+            <wp:docPr id="5" name="Picture 5" descr="A screenshot of a computer&#10;&#10;Description automatically generated"/>
+            <wp:cNvGraphicFramePr>
+              <a:graphicFrameLocks xmlns:a="http://schemas.openxmlformats.org/drawingml/2006/main" noChangeAspect="1"/>
+            </wp:cNvGraphicFramePr>
+            <a:graphic xmlns:a="http://schemas.openxmlformats.org/drawingml/2006/main">
+              <a:graphicData uri="http://schemas.openxmlformats.org/drawingml/2006/picture">
+                <pic:pic xmlns:pic="http://schemas.openxmlformats.org/drawingml/2006/picture">
+                  <pic:nvPicPr>
+                    <pic:cNvPr id="5" name="Picture 5" descr="A screenshot of a computer&#10;&#10;Description automatically generated"/>
+                    <pic:cNvPicPr>
+                      <a:picLocks noChangeAspect="1"/>
+                    </pic:cNvPicPr>
+                  </pic:nvPicPr>
+                  <pic:blipFill>
+                    <a:blip r:embed="rId10"/>
+                    <a:stretch>
+                      <a:fillRect/>
+                    </a:stretch>
+                  </pic:blipFill>
+                  <pic:spPr>
+                    <a:xfrm>
+                      <a:off x="0" y="0"/>
+                      <a:ext cx="5264785" cy="2192020"/>
+                    </a:xfrm>
+                    <a:prstGeom prst="rect">
+                      <a:avLst/>
+                    </a:prstGeom>
+                    <a:noFill/>
+                    <a:ln>
+                      <a:noFill/>
+                    </a:ln>
+                  </pic:spPr>
+                </pic:pic>
+              </a:graphicData>
+            </a:graphic>
+          </wp:inline>
+        </w:drawing>
+      </w:r>
+    </w:p>
+    <w:p/>
+    <w:p/>
+    <w:p/>
+    <w:p>
+      <w:pPr>
+        <w:rPr>
+          <w:noProof/>
+        </w:rPr>
+      </w:pPr>
+    </w:p>
+    <w:p>
+      <w:pPr>
+        <w:rPr>
+          <w:noProof/>
+        </w:rPr>
+      </w:pPr>
+      <w:r>
+        <w:rPr>
+          <w:noProof/>
+        </w:rPr>
+        <w:drawing>
+          <wp:inline distT="0" distB="0" distL="114300" distR="114300" wp14:anchorId="3AEC18DE" wp14:editId="0E82D704">
+            <wp:extent cx="5270500" cy="1992630"/>
+            <wp:effectExtent l="0" t="0" r="2540" b="3810"/>
+            <wp:docPr id="6" name="Picture 6" descr="A screenshot of a computer&#10;&#10;Description automatically generated"/>
+            <wp:cNvGraphicFramePr>
+              <a:graphicFrameLocks xmlns:a="http://schemas.openxmlformats.org/drawingml/2006/main" noChangeAspect="1"/>
+            </wp:cNvGraphicFramePr>
+            <a:graphic xmlns:a="http://schemas.openxmlformats.org/drawingml/2006/main">
+              <a:graphicData uri="http://schemas.openxmlformats.org/drawingml/2006/picture">
+                <pic:pic xmlns:pic="http://schemas.openxmlformats.org/drawingml/2006/picture">
+                  <pic:nvPicPr>
+                    <pic:cNvPr id="6" name="Picture 6" descr="A screenshot of a computer&#10;&#10;Description automatically generated"/>
+                    <pic:cNvPicPr>
+                      <a:picLocks noChangeAspect="1"/>
+                    </pic:cNvPicPr>
+                  </pic:nvPicPr>
+                  <pic:blipFill>
+                    <a:blip r:embed="rId11"/>
+                    <a:stretch>
+                      <a:fillRect/>
+                    </a:stretch>
+                  </pic:blipFill>
+                  <pic:spPr>
+                    <a:xfrm>
+                      <a:off x="0" y="0"/>
+                      <a:ext cx="5270500" cy="1992630"/>
+                    </a:xfrm>
+                    <a:prstGeom prst="rect">
+                      <a:avLst/>
+                    </a:prstGeom>
+                    <a:noFill/>
+                    <a:ln>
+                      <a:noFill/>
+                    </a:ln>
+                  </pic:spPr>
+                </pic:pic>
+              </a:graphicData>
+            </a:graphic>
+          </wp:inline>
+        </w:drawing>
+      </w:r>
+    </w:p>
+    <w:p/>
+    <w:p>
+      <w:pPr>
+        <w:rPr>
+          <w:noProof/>
+        </w:rPr>
+      </w:pPr>
+    </w:p>
+    <w:p>
+      <w:pPr>
+        <w:rPr>
+          <w:noProof/>
+        </w:rPr>
+      </w:pPr>
+      <w:r>
+        <w:rPr>
+          <w:noProof/>
+        </w:rPr>
+        <w:lastRenderedPageBreak/>
+        <w:drawing>
+          <wp:inline distT="0" distB="0" distL="114300" distR="114300" wp14:anchorId="100429B8" wp14:editId="0AC130CB">
+            <wp:extent cx="5273040" cy="2105660"/>
+            <wp:effectExtent l="0" t="0" r="0" b="12700"/>
+            <wp:docPr id="7" name="Picture 7" descr="A screenshot of a computer&#10;&#10;Description automatically generated"/>
+            <wp:cNvGraphicFramePr>
+              <a:graphicFrameLocks xmlns:a="http://schemas.openxmlformats.org/drawingml/2006/main" noChangeAspect="1"/>
+            </wp:cNvGraphicFramePr>
+            <a:graphic xmlns:a="http://schemas.openxmlformats.org/drawingml/2006/main">
+              <a:graphicData uri="http://schemas.openxmlformats.org/drawingml/2006/picture">
+                <pic:pic xmlns:pic="http://schemas.openxmlformats.org/drawingml/2006/picture">
+                  <pic:nvPicPr>
+                    <pic:cNvPr id="7" name="Picture 7" descr="A screenshot of a computer&#10;&#10;Description automatically generated"/>
+                    <pic:cNvPicPr>
+                      <a:picLocks noChangeAspect="1"/>
+                    </pic:cNvPicPr>
+                  </pic:nvPicPr>
+                  <pic:blipFill>
+                    <a:blip r:embed="rId12"/>
+                    <a:stretch>
+                      <a:fillRect/>
+                    </a:stretch>
+                  </pic:blipFill>
+                  <pic:spPr>
+                    <a:xfrm>
+                      <a:off x="0" y="0"/>
+                      <a:ext cx="5273040" cy="2105660"/>
+                    </a:xfrm>
+                    <a:prstGeom prst="rect">
+                      <a:avLst/>
+                    </a:prstGeom>
+                    <a:noFill/>
+                    <a:ln>
+                      <a:noFill/>
+                    </a:ln>
+                  </pic:spPr>
+                </pic:pic>
+              </a:graphicData>
+            </a:graphic>
+          </wp:inline>
+        </w:drawing>
+      </w:r>
+    </w:p>
+    <w:p/>
+    <w:p/>
+    <w:p>
+      <w:pPr>
+        <w:rPr>
+          <w:noProof/>
+        </w:rPr>
+      </w:pPr>
+    </w:p>
+    <w:p>
+      <w:pPr>
+        <w:rPr>
+          <w:noProof/>
+        </w:rPr>
+      </w:pPr>
+      <w:r>
+        <w:rPr>
+          <w:noProof/>
+        </w:rPr>
+        <w:drawing>
+          <wp:inline distT="0" distB="0" distL="114300" distR="114300" wp14:anchorId="76C71EF0" wp14:editId="4FFAC3FD">
+            <wp:extent cx="5267960" cy="2107565"/>
+            <wp:effectExtent l="0" t="0" r="5080" b="10795"/>
+            <wp:docPr id="8" name="Picture 8" descr="A screenshot of a computer&#10;&#10;Description automatically generated"/>
+            <wp:cNvGraphicFramePr>
+              <a:graphicFrameLocks xmlns:a="http://schemas.openxmlformats.org/drawingml/2006/main" noChangeAspect="1"/>
+            </wp:cNvGraphicFramePr>
+            <a:graphic xmlns:a="http://schemas.openxmlformats.org/drawingml/2006/main">
+              <a:graphicData uri="http://schemas.openxmlformats.org/drawingml/2006/picture">
+                <pic:pic xmlns:pic="http://schemas.openxmlformats.org/drawingml/2006/picture">
+                  <pic:nvPicPr>
+                    <pic:cNvPr id="8" name="Picture 8" descr="A screenshot of a computer&#10;&#10;Description automatically generated"/>
+                    <pic:cNvPicPr>
+                      <a:picLocks noChangeAspect="1"/>
+                    </pic:cNvPicPr>
+                  </pic:nvPicPr>
+                  <pic:blipFill>
+                    <a:blip r:embed="rId13"/>
+                    <a:stretch>
+                      <a:fillRect/>
+                    </a:stretch>
+                  </pic:blipFill>
+                  <pic:spPr>
+                    <a:xfrm>
+                      <a:off x="0" y="0"/>
+                      <a:ext cx="5267960" cy="2107565"/>
+                    </a:xfrm>
+                    <a:prstGeom prst="rect">
+                      <a:avLst/>
+                    </a:prstGeom>
+                    <a:noFill/>
+                    <a:ln>
+                      <a:noFill/>
+                    </a:ln>
+                  </pic:spPr>
+                </pic:pic>
+              </a:graphicData>
+            </a:graphic>
+          </wp:inline>
+        </w:drawing>
+      </w:r>
+      <w:r>
+        <w:tab/>
+      </w:r>
+    </w:p>
+    <w:p/>
+    <w:p/>
+    <w:p/>
+    <w:p/>
+    <w:p>
+      <w:pPr>
+        <w:rPr>
+          <w:noProof/>
+        </w:rPr>
+      </w:pPr>
+    </w:p>
+    <w:p>
+      <w:r>
+        <w:rPr>
+          <w:noProof/>
+        </w:rPr>
+        <w:lastRenderedPageBreak/>
+        <w:drawing>
+          <wp:inline distT="0" distB="0" distL="114300" distR="114300" wp14:anchorId="68F984A8" wp14:editId="47630C41">
+            <wp:extent cx="5273040" cy="1883410"/>
+            <wp:effectExtent l="0" t="0" r="0" b="6350"/>
+            <wp:docPr id="9" name="Picture 9" descr="A screenshot of a computer&#10;&#10;Description automatically generated"/>
+            <wp:cNvGraphicFramePr>
+              <a:graphicFrameLocks xmlns:a="http://schemas.openxmlformats.org/drawingml/2006/main" noChangeAspect="1"/>
+            </wp:cNvGraphicFramePr>
+            <a:graphic xmlns:a="http://schemas.openxmlformats.org/drawingml/2006/main">
+              <a:graphicData uri="http://schemas.openxmlformats.org/drawingml/2006/picture">
+                <pic:pic xmlns:pic="http://schemas.openxmlformats.org/drawingml/2006/picture">
+                  <pic:nvPicPr>
+                    <pic:cNvPr id="9" name="Picture 9" descr="A screenshot of a computer&#10;&#10;Description automatically generated"/>
+                    <pic:cNvPicPr>
+                      <a:picLocks noChangeAspect="1"/>
+                    </pic:cNvPicPr>
+                  </pic:nvPicPr>
+                  <pic:blipFill>
+                    <a:blip r:embed="rId14"/>
+                    <a:stretch>
+                      <a:fillRect/>
+                    </a:stretch>
+                  </pic:blipFill>
+                  <pic:spPr>
+                    <a:xfrm>
+                      <a:off x="0" y="0"/>
+                      <a:ext cx="5273040" cy="1883410"/>
+                    </a:xfrm>
+                    <a:prstGeom prst="rect">
+                      <a:avLst/>
+                    </a:prstGeom>
+                    <a:noFill/>
+                    <a:ln>
+                      <a:noFill/>
+                    </a:ln>
+                  </pic:spPr>
+                </pic:pic>
+              </a:graphicData>
+            </a:graphic>
+          </wp:inline>
+        </w:drawing>
+      </w:r>
+    </w:p>
     <w:sectPr>
       <w:pgSz w:w="12240" w:h="15840"/>
       <w:pgMar w:top="1440" w:right="1440" w:bottom="1440" w:left="1440" w:header="720" w:footer="720" w:gutter="0"/>
@@ -160,6 +467,56 @@
     </w:sectPr>
   </w:body>
 </w:document>
+</file>
+
+<file path=word/endnotes.xml><?xml version="1.0" encoding="utf-8"?>
+<w:endnotes xmlns:wpc="http://schemas.microsoft.com/office/word/2010/wordprocessingCanvas" xmlns:cx="http://schemas.microsoft.com/office/drawing/2014/chartex" xmlns:cx1="http://schemas.microsoft.com/office/drawing/2015/9/8/chartex" xmlns:cx2="http://schemas.microsoft.com/office/drawing/2015/10/21/chartex" xmlns:cx3="http://schemas.microsoft.com/office/drawing/2016/5/9/chartex" xmlns:cx4="http://schemas.microsoft.com/office/drawing/2016/5/10/chartex" xmlns:cx5="http://schemas.microsoft.com/office/drawing/2016/5/11/chartex" xmlns:cx6="http://schemas.microsoft.com/office/drawing/2016/5/12/chartex" xmlns:cx7="http://schemas.microsoft.com/office/drawing/2016/5/13/chartex" xmlns:cx8="http://schemas.microsoft.com/office/drawing/2016/5/14/chartex" xmlns:mc="http://schemas.openxmlformats.org/markup-compatibility/2006" xmlns:aink="http://schemas.microsoft.com/office/drawing/2016/ink" xmlns:am3d="http://schemas.microsoft.com/office/drawing/2017/model3d" xmlns:o="urn:schemas-microsoft-com:office:office" xmlns:r="http://schemas.openxmlformats.org/officeDocument/2006/relationships" xmlns:m="http://schemas.openxmlformats.org/officeDocument/2006/math" xmlns:v="urn:schemas-microsoft-com:vml" xmlns:wp14="http://schemas.microsoft.com/office/word/2010/wordprocessingDrawing" xmlns:wp="http://schemas.openxmlformats.org/drawingml/2006/wordprocessingDrawing" xmlns:w10="urn:schemas-microsoft-com:office:word" xmlns:w="http://schemas.openxmlformats.org/wordprocessingml/2006/main" xmlns:w14="http://schemas.microsoft.com/office/word/2010/wordml" xmlns:w15="http://schemas.microsoft.com/office/word/2012/wordml" xmlns:w16cex="http://schemas.microsoft.com/office/word/2018/wordml/cex" xmlns:w16cid="http://schemas.microsoft.com/office/word/2016/wordml/cid" xmlns:w16="http://schemas.microsoft.com/office/word/2018/wordml" xmlns:w16se="http://schemas.microsoft.com/office/word/2015/wordml/symex" xmlns:wpg="http://schemas.microsoft.com/office/word/2010/wordprocessingGroup" xmlns:wpi="http://schemas.microsoft.com/office/word/2010/wordprocessingInk" xmlns:wne="http://schemas.microsoft.com/office/word/2006/wordml" xmlns:wps="http://schemas.microsoft.com/office/word/2010/wordprocessingShape" mc:Ignorable="w14 w15 w16se w16cid w16 w16cex wp14">
+  <w:endnote w:type="separator" w:id="-1">
+    <w:p>
+      <w:pPr>
+        <w:spacing w:after="0" w:line="240" w:lineRule="auto"/>
+      </w:pPr>
+      <w:r>
+        <w:separator/>
+      </w:r>
+    </w:p>
+  </w:endnote>
+  <w:endnote w:type="continuationSeparator" w:id="0">
+    <w:p>
+      <w:pPr>
+        <w:spacing w:after="0" w:line="240" w:lineRule="auto"/>
+      </w:pPr>
+      <w:r>
+        <w:continuationSeparator/>
+      </w:r>
+    </w:p>
+  </w:endnote>
+</w:endnotes>
+</file>
+
+<file path=word/footnotes.xml><?xml version="1.0" encoding="utf-8"?>
+<w:footnotes xmlns:wpc="http://schemas.microsoft.com/office/word/2010/wordprocessingCanvas" xmlns:cx="http://schemas.microsoft.com/office/drawing/2014/chartex" xmlns:cx1="http://schemas.microsoft.com/office/drawing/2015/9/8/chartex" xmlns:cx2="http://schemas.microsoft.com/office/drawing/2015/10/21/chartex" xmlns:cx3="http://schemas.microsoft.com/office/drawing/2016/5/9/chartex" xmlns:cx4="http://schemas.microsoft.com/office/drawing/2016/5/10/chartex" xmlns:cx5="http://schemas.microsoft.com/office/drawing/2016/5/11/chartex" xmlns:cx6="http://schemas.microsoft.com/office/drawing/2016/5/12/chartex" xmlns:cx7="http://schemas.microsoft.com/office/drawing/2016/5/13/chartex" xmlns:cx8="http://schemas.microsoft.com/office/drawing/2016/5/14/chartex" xmlns:mc="http://schemas.openxmlformats.org/markup-compatibility/2006" xmlns:aink="http://schemas.microsoft.com/office/drawing/2016/ink" xmlns:am3d="http://schemas.microsoft.com/office/drawing/2017/model3d" xmlns:o="urn:schemas-microsoft-com:office:office" xmlns:r="http://schemas.openxmlformats.org/officeDocument/2006/relationships" xmlns:m="http://schemas.openxmlformats.org/officeDocument/2006/math" xmlns:v="urn:schemas-microsoft-com:vml" xmlns:wp14="http://schemas.microsoft.com/office/word/2010/wordprocessingDrawing" xmlns:wp="http://schemas.openxmlformats.org/drawingml/2006/wordprocessingDrawing" xmlns:w10="urn:schemas-microsoft-com:office:word" xmlns:w="http://schemas.openxmlformats.org/wordprocessingml/2006/main" xmlns:w14="http://schemas.microsoft.com/office/word/2010/wordml" xmlns:w15="http://schemas.microsoft.com/office/word/2012/wordml" xmlns:w16cex="http://schemas.microsoft.com/office/word/2018/wordml/cex" xmlns:w16cid="http://schemas.microsoft.com/office/word/2016/wordml/cid" xmlns:w16="http://schemas.microsoft.com/office/word/2018/wordml" xmlns:w16se="http://schemas.microsoft.com/office/word/2015/wordml/symex" xmlns:wpg="http://schemas.microsoft.com/office/word/2010/wordprocessingGroup" xmlns:wpi="http://schemas.microsoft.com/office/word/2010/wordprocessingInk" xmlns:wne="http://schemas.microsoft.com/office/word/2006/wordml" xmlns:wps="http://schemas.microsoft.com/office/word/2010/wordprocessingShape" mc:Ignorable="w14 w15 w16se w16cid w16 w16cex wp14">
+  <w:footnote w:type="separator" w:id="-1">
+    <w:p>
+      <w:pPr>
+        <w:spacing w:after="0" w:line="240" w:lineRule="auto"/>
+      </w:pPr>
+      <w:r>
+        <w:separator/>
+      </w:r>
+    </w:p>
+  </w:footnote>
+  <w:footnote w:type="continuationSeparator" w:id="0">
+    <w:p>
+      <w:pPr>
+        <w:spacing w:after="0" w:line="240" w:lineRule="auto"/>
+      </w:pPr>
+      <w:r>
+        <w:continuationSeparator/>
+      </w:r>
+    </w:p>
+  </w:footnote>
+</w:footnotes>
 </file>
 
 <file path=word/numbering.xml><?xml version="1.0" encoding="utf-8"?>
@@ -893,6 +1250,50 @@
       <w:sz w:val="26"/>
     </w:rPr>
   </w:style>
+  <w:style w:type="paragraph" w:styleId="Header">
+    <w:name w:val="header"/>
+    <w:basedOn w:val="Normal"/>
+    <w:link w:val="HeaderChar"/>
+    <w:uiPriority w:val="99"/>
+    <w:unhideWhenUsed/>
+    <w:rsid w:val="000D7BA5"/>
+    <w:pPr>
+      <w:tabs>
+        <w:tab w:val="center" w:pos="4680"/>
+        <w:tab w:val="right" w:pos="9360"/>
+      </w:tabs>
+      <w:spacing w:after="0" w:line="240" w:lineRule="auto"/>
+    </w:pPr>
+  </w:style>
+  <w:style w:type="character" w:customStyle="1" w:styleId="HeaderChar">
+    <w:name w:val="Header Char"/>
+    <w:basedOn w:val="DefaultParagraphFont"/>
+    <w:link w:val="Header"/>
+    <w:uiPriority w:val="99"/>
+    <w:rsid w:val="000D7BA5"/>
+  </w:style>
+  <w:style w:type="paragraph" w:styleId="Footer">
+    <w:name w:val="footer"/>
+    <w:basedOn w:val="Normal"/>
+    <w:link w:val="FooterChar"/>
+    <w:uiPriority w:val="99"/>
+    <w:unhideWhenUsed/>
+    <w:rsid w:val="000D7BA5"/>
+    <w:pPr>
+      <w:tabs>
+        <w:tab w:val="center" w:pos="4680"/>
+        <w:tab w:val="right" w:pos="9360"/>
+      </w:tabs>
+      <w:spacing w:after="0" w:line="240" w:lineRule="auto"/>
+    </w:pPr>
+  </w:style>
+  <w:style w:type="character" w:customStyle="1" w:styleId="FooterChar">
+    <w:name w:val="Footer Char"/>
+    <w:basedOn w:val="DefaultParagraphFont"/>
+    <w:link w:val="Footer"/>
+    <w:uiPriority w:val="99"/>
+    <w:rsid w:val="000D7BA5"/>
+  </w:style>
 </w:styles>
 </file>
 

</xml_diff>